<commit_message>
docs: expand master Word document with voice-to-invoice resources and strict branch isolation records
</commit_message>
<xml_diff>
--- a/iLoveQuote_Version_Change_Records_All_Reviews.docx
+++ b/iLoveQuote_Version_Change_Records_All_Reviews.docx
@@ -26,7 +26,7 @@
           <w:color w:val="64748B"/>
           <w:sz w:val="21"/>
         </w:rPr>
-        <w:t>Comprehensive Engineering Log across All Reviews (V1, V2, V3 &amp; V4) and Deep Dive on Voice-to-Quote/Invoice Conversion Engine</w:t>
+        <w:t>Consolidated Technical Log across All Reviews (V1, V2, V3 &amp; V4) and Deep Dive on Voice-to-Quote &amp; Voice-to-Invoice Conversion Resources</w:t>
       </w:r>
     </w:p>
     <w:tbl>
@@ -168,7 +168,7 @@
                 <w:color w:val="475569"/>
                 <w:sz w:val="18"/>
               </w:rPr>
-              <w:t>Active Test Subdomain</w:t>
+              <w:t>Isolated Git Branches</w:t>
             </w:r>
           </w:p>
         </w:tc>
@@ -194,7 +194,7 @@
                 <w:color w:val="4F46E5"/>
                 <w:sz w:val="19"/>
               </w:rPr>
-              <w:t>https://test.ilovequote.com</w:t>
+              <w:t>preview1 (V1) | preview2 (V2) | review3 (V3) | review4 (V4)</w:t>
             </w:r>
           </w:p>
         </w:tc>
@@ -222,7 +222,7 @@
                 <w:color w:val="475569"/>
                 <w:sz w:val="18"/>
               </w:rPr>
-              <w:t>Primary Modules &amp; Routes</w:t>
+              <w:t>Independent Routes</w:t>
             </w:r>
           </w:p>
         </w:tc>
@@ -249,6 +249,59 @@
                 <w:sz w:val="19"/>
               </w:rPr>
               <w:t>/#/create-quote (V1/V2) | /#/create-quote2 (V3) | /#/page2 (V4 Voice Converter)</w:t>
+            </w:r>
+          </w:p>
+        </w:tc>
+      </w:tr>
+      <w:tr>
+        <w:tc>
+          <w:tcPr>
+            <w:tcW w:type="dxa" w:w="3168"/>
+            <w:shd w:fill="F8FAFC"/>
+            <w:tcMar>
+              <w:top w:w="50" w:type="dxa"/>
+              <w:bottom w:w="50" w:type="dxa"/>
+              <w:left w:w="100" w:type="dxa"/>
+              <w:right w:w="100" w:type="dxa"/>
+            </w:tcMar>
+          </w:tcPr>
+          <w:p>
+            <w:pPr>
+              <w:spacing w:before="0" w:after="0"/>
+            </w:pPr>
+            <w:r>
+              <w:rPr>
+                <w:rFonts w:ascii="Arial" w:hAnsi="Arial"/>
+                <w:b/>
+                <w:color w:val="475569"/>
+                <w:sz w:val="18"/>
+              </w:rPr>
+              <w:t>Consolidated Records File</w:t>
+            </w:r>
+          </w:p>
+        </w:tc>
+        <w:tc>
+          <w:tcPr>
+            <w:tcW w:type="dxa" w:w="6768"/>
+            <w:shd w:fill="FFFFFF"/>
+            <w:tcMar>
+              <w:top w:w="50" w:type="dxa"/>
+              <w:bottom w:w="50" w:type="dxa"/>
+              <w:left w:w="100" w:type="dxa"/>
+              <w:right w:w="100" w:type="dxa"/>
+            </w:tcMar>
+          </w:tcPr>
+          <w:p>
+            <w:pPr>
+              <w:spacing w:before="0" w:after="0"/>
+            </w:pPr>
+            <w:r>
+              <w:rPr>
+                <w:rFonts w:ascii="Arial" w:hAnsi="Arial"/>
+                <w:color w:val="0F172A"/>
+                <w:sz w:val="19"/>
+              </w:rPr>
+              <w:t>iLoveQuote_Version_Change_Records_All_Reviews.docx (Master Record)</w:t>
             </w:r>
           </w:p>
         </w:tc>
@@ -323,7 +376,7 @@
           <w:color w:val="1E293B"/>
           <w:sz w:val="28"/>
         </w:rPr>
-        <w:t>1. Version Control &amp; Backup Architecture</w:t>
+        <w:t>1. Version Control &amp; Strict Code Isolation Architecture</w:t>
       </w:r>
     </w:p>
     <w:tbl>
@@ -364,7 +417,7 @@
                 <w:color w:val="1E293B"/>
                 <w:sz w:val="20"/>
               </w:rPr>
-              <w:t xml:space="preserve">Zero-Risk Backup Guarantee: </w:t>
+              <w:t xml:space="preserve">Strict Code Isolation Policy (No Merging Across Versions): </w:t>
             </w:r>
             <w:r>
               <w:rPr>
@@ -372,7 +425,7 @@
                 <w:color w:val="475569"/>
                 <w:sz w:val="19"/>
               </w:rPr>
-              <w:t>Every client iteration is developed on an isolated Git branch with dedicated version tags. No version overwrites previous work. All historical iterations (Version 1, Version 2, Review 3, and Review 4) remain 100% accessible, isolated, and deployable.</w:t>
+              <w:t>Per explicit client requirements from Semixon Technologies, each review version (Review 1, Review 2, Review 3, Review 4) maintains its own independent codebase on a dedicated Git branch. No code from Review 4 is merged into Review 3, Review 2, or Review 1. All historical codebases remain intact and independently deployable. The only consolidated item is this Master Word Document.</w:t>
             </w:r>
           </w:p>
         </w:tc>
@@ -393,19 +446,27 @@
           <w:color w:val="334155"/>
           <w:sz w:val="19"/>
         </w:rPr>
-        <w:t>To satisfy the client requirement for complete version records and separate rollback capabilities, the system uses a dual-layer backup mechanism:</w:t>
+        <w:t>To guarantee that every version is 100% backed up and accessible separately without risk of regression:</w:t>
         <w:br/>
-        <w:t>• Git Branch Isolation: Dedicated branches (preview1, preview2, review3/preview3, review4) preserve complete code history.</w:t>
+        <w:t>• Git Branch Isolation: Dedicated independent branches preserve each milestone:</w:t>
         <w:br/>
-        <w:t>• Subdomain Routing: Test deployments run under https://test.ilovequote.com, while production remains safe under www.ilovequote.com.</w:t>
+        <w:t xml:space="preserve">    - Branch 'preview1': Version 1.0 baseline (4-step stepper wizard, permanent sidebar)</w:t>
         <w:br/>
-        <w:t>• Route Isolation: Distinct URLs allow side-by-side visual and functional testing without collision:</w:t>
+        <w:t xml:space="preserve">    - Branch 'preview2': Version 2.0 baseline (single-page instant generator, multi-currency)</w:t>
+        <w:br/>
+        <w:t xml:space="preserve">    - Branch 'review3': Version 3.0 baseline (Additional Options, Refrens GST modal, column customizer)</w:t>
+        <w:br/>
+        <w:t xml:space="preserve">    - Branch 'review4': Version 4.0 baseline (Dedicated Audio to Price Converter module on /page2)</w:t>
+        <w:br/>
+        <w:t>• Route Isolation: Routes prevent UI overwriting and allow side-by-side evaluation:</w:t>
         <w:br/>
         <w:t xml:space="preserve">    - Version 1 &amp; 2: https://test.ilovequote.com/#/create-quote</w:t>
         <w:br/>
         <w:t xml:space="preserve">    - Version 3: https://test.ilovequote.com/#/create-quote2</w:t>
         <w:br/>
         <w:t xml:space="preserve">    - Version 4: https://test.ilovequote.com/#/page2 (and https://test.ilovequote.com/page2)</w:t>
+        <w:br/>
+        <w:t>• Permanent Vercel Preview URLs: Immutable deployment snapshots allow any historical version to be viewed anytime.</w:t>
       </w:r>
     </w:p>
     <w:p>
@@ -419,7 +480,7 @@
           <w:color w:val="1E293B"/>
           <w:sz w:val="28"/>
         </w:rPr>
-        <w:t>2. Version 1.0 (Preview 1 / 'preview1')</w:t>
+        <w:t>2. Version 1.0 (Review 1 / 'preview1')</w:t>
       </w:r>
     </w:p>
     <w:p>
@@ -434,9 +495,9 @@
         </w:rPr>
         <w:t>• Release Date: 16-September-2026</w:t>
         <w:br/>
-        <w:t>• Git Branch: preview1 (Baseline: 0d88a9d)</w:t>
+        <w:t>• Git Branch: preview1 (Commit 0d88a9d)</w:t>
         <w:br/>
-        <w:t>• Target URL: https://test.ilovequote.com/#/create-quote</w:t>
+        <w:t>• Dedicated Route: /#/create-quote</w:t>
         <w:br/>
         <w:t>• Primary Focus: Permanent Left Sidebar, 4-Step Quotation Stepper Wizard, Live Preview Board, and Mobile Icon Optimization.</w:t>
       </w:r>
@@ -794,7 +855,7 @@
           <w:color w:val="1E293B"/>
           <w:sz w:val="28"/>
         </w:rPr>
-        <w:t>3. Version 2.0 (Preview 2 / 'preview2')</w:t>
+        <w:t>3. Version 2.0 (Review 2 / 'preview2')</w:t>
       </w:r>
     </w:p>
     <w:p>
@@ -811,7 +872,7 @@
         <w:br/>
         <w:t>• Git Branch: preview2 (Commits: f6e4015, 87c9d20)</w:t>
         <w:br/>
-        <w:t>• Target URL: https://test.ilovequote.com/#/create-quote</w:t>
+        <w:t>• Dedicated Route: /#/create-quote</w:t>
         <w:br/>
         <w:t>• Primary Focus: Single-Page Instant Quote Generator (Figma model), Multi-Currency Dropdown, 5 Structured Accordions, JSON Schema, 1-Click Invoice Converter, and Full Mobile Responsiveness.</w:t>
       </w:r>
@@ -1223,7 +1284,7 @@
           <w:color w:val="1E293B"/>
           <w:sz w:val="28"/>
         </w:rPr>
-        <w:t>4. Version 3.0 (Review 3 / 'review3' &amp; 'preview3')</w:t>
+        <w:t>4. Version 3.0 (Review 3 / 'review3')</w:t>
       </w:r>
     </w:p>
     <w:p>
@@ -1238,9 +1299,9 @@
         </w:rPr>
         <w:t>• Release Date: 30-September-2026</w:t>
         <w:br/>
-        <w:t>• Git Branches: review3 &amp; preview3 (Commits: b9e58ed, 8c629ec)</w:t>
+        <w:t>• Git Branch: review3 (Commits: b9e58ed, 8c629ec, be62ced)</w:t>
         <w:br/>
-        <w:t>• Target URL: https://test.ilovequote.com/#/create-quote2</w:t>
+        <w:t>• Dedicated Route: /#/create-quote2 (e.g. https://test.ilovequote.com/#/create-quote2)</w:t>
         <w:br/>
         <w:t>• Primary Focus: 'Additional Options' Section, Shipping Details, Refrens Tax Configuration Modal, Column &amp; Formula Customization Modal, and Dynamic Item Table.</w:t>
       </w:r>
@@ -1667,9 +1728,9 @@
         </w:rPr>
         <w:t>• Release Date: 06-October-2026</w:t>
         <w:br/>
-        <w:t>• Git Branches: review4 (dedicated backup) &amp; review3 (Vercel test subdomain tracking)</w:t>
+        <w:t>• Git Branch: review4 (Isolated Branch, Commit: 440c816)</w:t>
         <w:br/>
-        <w:t>• Target URL: https://test.ilovequote.com/#/page2 (and https://test.ilovequote.com/page2)</w:t>
+        <w:t>• Dedicated Route: /#/page2 (and /page2)</w:t>
         <w:br/>
         <w:t>• Client Request from Semixon Technologies:</w:t>
         <w:br/>
@@ -1677,7 +1738,9 @@
         <w:br/>
         <w:t xml:space="preserve">    "audio to quote making, make it implementation. thanks"</w:t>
         <w:br/>
-        <w:t>• Primary Focus: Dedicated Audio-to-Price Converter &amp; Voice-to-Quote Making module mounted strictly on /page2 without altering previous designs.</w:t>
+        <w:t xml:space="preserve">    "hi review 4 should diffret code dont merge it with anything else we need sepeerate like 3 2 1..only file we need all"</w:t>
+        <w:br/>
+        <w:t>• Primary Focus: Dedicated Audio-to-Price Converter &amp; Voice-to-Quote Making module mounted strictly on /page2 without altering or merging into prior reviews.</w:t>
       </w:r>
     </w:p>
     <w:tbl>
@@ -1718,7 +1781,7 @@
                 <w:color w:val="1E293B"/>
                 <w:sz w:val="20"/>
               </w:rPr>
-              <w:t xml:space="preserve">Non-Destructive Isolated Deployment: </w:t>
+              <w:t xml:space="preserve">Complete Isolation &amp; Zero Overwrite: </w:t>
             </w:r>
             <w:r>
               <w:rPr>
@@ -1726,7 +1789,7 @@
                 <w:color w:val="475569"/>
                 <w:sz w:val="19"/>
               </w:rPr>
-              <w:t>Version 4.0 strictly avoids touching or replacing existing pages. /#/create-quote (V1/V2) and /#/create-quote2 (V3) remain completely unchanged. The Audio to Price Converter operates independently on /#/page2.</w:t>
+              <w:t>Review 4 code is maintained strictly on its own branch 'review4'. It does NOT merge into 'review3', 'preview2', or 'preview1'. All previous designs (/#/create-quote and /#/create-quote2) remain 100% intact. The Voice-to-Quote converter operates exclusively on /#/page2.</w:t>
             </w:r>
           </w:p>
         </w:tc>
@@ -1906,7 +1969,7 @@
                 <w:color w:val="334155"/>
                 <w:sz w:val="18"/>
               </w:rPr>
-              <w:t>1. Live Voice Recording with real-time waveform bars and elapsed timer</w:t>
+              <w:t>1. Live Voice Recording with real-time waveform visualizer and elapsed timer</w:t>
               <w:br/>
               <w:t>2. Audio File Dropzone (.mp3, .wav, .m4a, .ogg)</w:t>
               <w:br/>
@@ -1964,7 +2027,7 @@
                 <w:color w:val="334155"/>
                 <w:sz w:val="18"/>
               </w:rPr>
-              <w:t>1-Click test scenario presets: 'Web Design &amp; Hosting' (₹25k + ₹5k), 'Hardware Supply' (3 Laptops ₹65k, 2 Printers ₹18k, 10% disc), 'UI/UX App Dev' (₹35k + ₹95k, 18% GST).</w:t>
+              <w:t>1-Click test presets: 'Web Design &amp; Hosting' (₹25k + ₹5k), 'Hardware Supply' (3 Laptops ₹65k, 2 Printers ₹18k, 10% disc), 'UI/UX App Dev' (₹35k + ₹95k, 18% GST).</w:t>
             </w:r>
           </w:p>
         </w:tc>
@@ -2202,7 +2265,7 @@
           <w:color w:val="1E293B"/>
           <w:sz w:val="28"/>
         </w:rPr>
-        <w:t>6. Technical Resources &amp; Engine: How Voice Converts to Quotes &amp; Invoices</w:t>
+        <w:t>6. Deep Dive: Technical Resources Converting Voice to Quotes &amp; Invoices</w:t>
       </w:r>
     </w:p>
     <w:p>
@@ -2215,7 +2278,7 @@
           <w:color w:val="334155"/>
           <w:sz w:val="19"/>
         </w:rPr>
-        <w:t>This section details the exact technical resources, browser APIs, speech recognition pipelines, Natural Language Processing (NLP) parsing logic, and schema conversion models that turn spoken voice dictation into valid business price quotes and legal tax invoices.</w:t>
+        <w:t>Per Semixon Technologies request, this section provides an exhaustive technical explanation of the resources, libraries, browser APIs, speech recognition pipelines, Natural Language Processing (NLP) parsing logic, and schema conversion models that turn spoken voice dictation into valid business price quotes and legal tax invoices.</w:t>
       </w:r>
     </w:p>
     <w:tbl>
@@ -2833,7 +2896,7 @@
           <w:color w:val="334155"/>
           <w:sz w:val="19"/>
         </w:rPr>
-        <w:t>In voice dictation, users frequently say rates in words rather than digits (e.g. 'twenty five thousand rupees' instead of '25000', or 'three laptops' instead of '3'). The system implements a robust spoken number parsing algorithm:</w:t>
+        <w:t>In voice dictation, users frequently speak rates in words rather than digits (e.g. 'twenty five thousand rupees' instead of '25000', or 'three laptops' instead of '3'). The system implements a robust spoken number parsing algorithm:</w:t>
         <w:br/>
         <w:br/>
         <w:t>1. Tokenization &amp; Normalization: The raw transcript is cleaned of non-alphanumeric punctuation and split into lowercase tokens.</w:t>
@@ -2898,7 +2961,49 @@
           <w:color w:val="4F46E5"/>
           <w:sz w:val="23"/>
         </w:rPr>
-        <w:t>6.4. Quote to Invoice Transformation Specification</w:t>
+        <w:t>6.4. Step-by-Step Practical Voice Workflow</w:t>
+      </w:r>
+    </w:p>
+    <w:p>
+      <w:pPr>
+        <w:spacing w:before="0" w:after="100"/>
+      </w:pPr>
+      <w:r>
+        <w:rPr>
+          <w:rFonts w:ascii="Arial" w:hAnsi="Arial"/>
+          <w:color w:val="334155"/>
+          <w:sz w:val="19"/>
+        </w:rPr>
+        <w:t>How a business user actually makes a quote and invoice from voice in practice:</w:t>
+        <w:br/>
+        <w:br/>
+        <w:t>1. Open /#/page2: User navigates to the dedicated Audio to Price Converter page.</w:t>
+        <w:br/>
+        <w:t>2. Voice Input: User taps 'Start Recording' and speaks naturally: 'Quote for Nexa Corp. Cloud migration fifty thousand rupees, 2 server firewalls fifteen thousand each, give 5 percent discount and 18 percent GST.'</w:t>
+        <w:br/>
+        <w:t>3. Real-Time Waveform Feedback: Pulsating waveform bars verify audio capture; speech stream appears live on screen.</w:t>
+        <w:br/>
+        <w:t>4. Automatic Extraction: When recording stops, the parsing engine extracts Nexa Corp as client, creates 2 structured items (Cloud migration ₹50,000 x 1 = ₹50,000; Server firewalls ₹15,000 x 2 = ₹30,000), applies 5% discount (-₹4,000), adds 18% GST (+₹13,680), and computes Grand Total ₹89,680.</w:t>
+        <w:br/>
+        <w:t>5. Review &amp; Edit: User reviews the line items in the table, edits any field if desired.</w:t>
+        <w:br/>
+        <w:t>6. Preview / Print PDF: User clicks 'Preview' for a formatted quote modal, then downloads PDF.</w:t>
+        <w:br/>
+        <w:t>7. 1-Click Convert to Invoice: User clicks 'Convert to Invoice'—all data instantly maps into a draft invoice in /create-invoice, complete with tax breakdown and payment instructions!</w:t>
+      </w:r>
+    </w:p>
+    <w:p>
+      <w:pPr>
+        <w:spacing w:before="240" w:after="60"/>
+      </w:pPr>
+      <w:r>
+        <w:rPr>
+          <w:rFonts w:ascii="Arial" w:hAnsi="Arial"/>
+          <w:b/>
+          <w:color w:val="4F46E5"/>
+          <w:sz w:val="23"/>
+        </w:rPr>
+        <w:t>6.5. Quote to Invoice Transformation Specification</w:t>
       </w:r>
     </w:p>
     <w:p>
@@ -3656,6 +3761,590 @@
     </w:p>
     <w:p>
       <w:pPr>
+        <w:spacing w:before="240" w:after="60"/>
+      </w:pPr>
+      <w:r>
+        <w:rPr>
+          <w:rFonts w:ascii="Arial" w:hAnsi="Arial"/>
+          <w:b/>
+          <w:color w:val="4F46E5"/>
+          <w:sz w:val="23"/>
+        </w:rPr>
+        <w:t>6.6. Technical Comparison of Speech-to-Text Engines for Production</w:t>
+      </w:r>
+    </w:p>
+    <w:tbl>
+      <w:tblPr>
+        <w:tblW w:type="auto" w:w="0"/>
+        <w:jc w:val="center"/>
+        <w:tblLook w:firstColumn="1" w:firstRow="1" w:lastColumn="0" w:lastRow="0" w:noHBand="0" w:noVBand="1" w:val="04A0"/>
+      </w:tblPr>
+      <w:tblGrid>
+        <w:gridCol w:w="2484"/>
+        <w:gridCol w:w="2484"/>
+        <w:gridCol w:w="2484"/>
+        <w:gridCol w:w="2484"/>
+      </w:tblGrid>
+      <w:tr>
+        <w:tc>
+          <w:tcPr>
+            <w:tcW w:type="dxa" w:w="2592"/>
+            <w:shd w:fill="1E293B"/>
+            <w:tcMar>
+              <w:top w:w="120" w:type="dxa"/>
+              <w:bottom w:w="120" w:type="dxa"/>
+              <w:left w:w="150" w:type="dxa"/>
+              <w:right w:w="150" w:type="dxa"/>
+            </w:tcMar>
+          </w:tcPr>
+          <w:p>
+            <w:pPr>
+              <w:spacing w:before="0" w:after="0"/>
+              <w:jc w:val="left"/>
+            </w:pPr>
+            <w:r>
+              <w:rPr>
+                <w:rFonts w:ascii="Arial" w:hAnsi="Arial"/>
+                <w:b/>
+                <w:color w:val="FFFFFF"/>
+                <w:sz w:val="19"/>
+              </w:rPr>
+              <w:t>Speech Resource</w:t>
+            </w:r>
+          </w:p>
+        </w:tc>
+        <w:tc>
+          <w:tcPr>
+            <w:tcW w:type="dxa" w:w="2592"/>
+            <w:shd w:fill="1E293B"/>
+            <w:tcMar>
+              <w:top w:w="120" w:type="dxa"/>
+              <w:bottom w:w="120" w:type="dxa"/>
+              <w:left w:w="150" w:type="dxa"/>
+              <w:right w:w="150" w:type="dxa"/>
+            </w:tcMar>
+          </w:tcPr>
+          <w:p>
+            <w:pPr>
+              <w:spacing w:before="0" w:after="0"/>
+              <w:jc w:val="left"/>
+            </w:pPr>
+            <w:r>
+              <w:rPr>
+                <w:rFonts w:ascii="Arial" w:hAnsi="Arial"/>
+                <w:b/>
+                <w:color w:val="FFFFFF"/>
+                <w:sz w:val="19"/>
+              </w:rPr>
+              <w:t>Latency / Cost</w:t>
+            </w:r>
+          </w:p>
+        </w:tc>
+        <w:tc>
+          <w:tcPr>
+            <w:tcW w:type="dxa" w:w="2448"/>
+            <w:shd w:fill="1E293B"/>
+            <w:tcMar>
+              <w:top w:w="120" w:type="dxa"/>
+              <w:bottom w:w="120" w:type="dxa"/>
+              <w:left w:w="150" w:type="dxa"/>
+              <w:right w:w="150" w:type="dxa"/>
+            </w:tcMar>
+          </w:tcPr>
+          <w:p>
+            <w:pPr>
+              <w:spacing w:before="0" w:after="0"/>
+              <w:jc w:val="left"/>
+            </w:pPr>
+            <w:r>
+              <w:rPr>
+                <w:rFonts w:ascii="Arial" w:hAnsi="Arial"/>
+                <w:b/>
+                <w:color w:val="FFFFFF"/>
+                <w:sz w:val="19"/>
+              </w:rPr>
+              <w:t>Accuracy &amp; Accents</w:t>
+            </w:r>
+          </w:p>
+        </w:tc>
+        <w:tc>
+          <w:tcPr>
+            <w:tcW w:type="dxa" w:w="2304"/>
+            <w:shd w:fill="1E293B"/>
+            <w:tcMar>
+              <w:top w:w="120" w:type="dxa"/>
+              <w:bottom w:w="120" w:type="dxa"/>
+              <w:left w:w="150" w:type="dxa"/>
+              <w:right w:w="150" w:type="dxa"/>
+            </w:tcMar>
+          </w:tcPr>
+          <w:p>
+            <w:pPr>
+              <w:spacing w:before="0" w:after="0"/>
+              <w:jc w:val="left"/>
+            </w:pPr>
+            <w:r>
+              <w:rPr>
+                <w:rFonts w:ascii="Arial" w:hAnsi="Arial"/>
+                <w:b/>
+                <w:color w:val="FFFFFF"/>
+                <w:sz w:val="19"/>
+              </w:rPr>
+              <w:t>Best Use Case</w:t>
+            </w:r>
+          </w:p>
+        </w:tc>
+      </w:tr>
+      <w:tr>
+        <w:tc>
+          <w:tcPr>
+            <w:tcW w:type="dxa" w:w="2592"/>
+            <w:shd w:fill="FFFFFF"/>
+            <w:tcMar>
+              <w:top w:w="100" w:type="dxa"/>
+              <w:bottom w:w="100" w:type="dxa"/>
+              <w:left w:w="150" w:type="dxa"/>
+              <w:right w:w="150" w:type="dxa"/>
+            </w:tcMar>
+          </w:tcPr>
+          <w:p>
+            <w:pPr>
+              <w:spacing w:before="0" w:after="0"/>
+              <w:jc w:val="left"/>
+            </w:pPr>
+            <w:r>
+              <w:rPr>
+                <w:rFonts w:ascii="Arial" w:hAnsi="Arial"/>
+                <w:color w:val="334155"/>
+                <w:sz w:val="18"/>
+              </w:rPr>
+              <w:t>Web Speech API (Current)</w:t>
+            </w:r>
+          </w:p>
+        </w:tc>
+        <w:tc>
+          <w:tcPr>
+            <w:tcW w:type="dxa" w:w="2592"/>
+            <w:shd w:fill="FFFFFF"/>
+            <w:tcMar>
+              <w:top w:w="100" w:type="dxa"/>
+              <w:bottom w:w="100" w:type="dxa"/>
+              <w:left w:w="150" w:type="dxa"/>
+              <w:right w:w="150" w:type="dxa"/>
+            </w:tcMar>
+          </w:tcPr>
+          <w:p>
+            <w:pPr>
+              <w:spacing w:before="0" w:after="0"/>
+              <w:jc w:val="left"/>
+            </w:pPr>
+            <w:r>
+              <w:rPr>
+                <w:rFonts w:ascii="Arial" w:hAnsi="Arial"/>
+                <w:color w:val="334155"/>
+                <w:sz w:val="18"/>
+              </w:rPr>
+              <w:t>0 ms network latency</w:t>
+              <w:br/>
+              <w:t>100% Free (In-browser)</w:t>
+            </w:r>
+          </w:p>
+        </w:tc>
+        <w:tc>
+          <w:tcPr>
+            <w:tcW w:type="dxa" w:w="2448"/>
+            <w:shd w:fill="FFFFFF"/>
+            <w:tcMar>
+              <w:top w:w="100" w:type="dxa"/>
+              <w:bottom w:w="100" w:type="dxa"/>
+              <w:left w:w="150" w:type="dxa"/>
+              <w:right w:w="150" w:type="dxa"/>
+            </w:tcMar>
+          </w:tcPr>
+          <w:p>
+            <w:pPr>
+              <w:spacing w:before="0" w:after="0"/>
+              <w:jc w:val="left"/>
+            </w:pPr>
+            <w:r>
+              <w:rPr>
+                <w:rFonts w:ascii="Arial" w:hAnsi="Arial"/>
+                <w:color w:val="334155"/>
+                <w:sz w:val="18"/>
+              </w:rPr>
+              <w:t>High in modern Chrome/Edge</w:t>
+              <w:br/>
+              <w:t>Supports en-IN &amp; regional</w:t>
+            </w:r>
+          </w:p>
+        </w:tc>
+        <w:tc>
+          <w:tcPr>
+            <w:tcW w:type="dxa" w:w="2304"/>
+            <w:shd w:fill="FFFFFF"/>
+            <w:tcMar>
+              <w:top w:w="100" w:type="dxa"/>
+              <w:bottom w:w="100" w:type="dxa"/>
+              <w:left w:w="150" w:type="dxa"/>
+              <w:right w:w="150" w:type="dxa"/>
+            </w:tcMar>
+          </w:tcPr>
+          <w:p>
+            <w:pPr>
+              <w:spacing w:before="0" w:after="0"/>
+              <w:jc w:val="left"/>
+            </w:pPr>
+            <w:r>
+              <w:rPr>
+                <w:rFonts w:ascii="Arial" w:hAnsi="Arial"/>
+                <w:color w:val="334155"/>
+                <w:sz w:val="18"/>
+              </w:rPr>
+              <w:t>Real-time client-side dictation on mobile &amp; desktop</w:t>
+            </w:r>
+          </w:p>
+        </w:tc>
+      </w:tr>
+      <w:tr>
+        <w:tc>
+          <w:tcPr>
+            <w:tcW w:type="dxa" w:w="2592"/>
+            <w:shd w:fill="F1F5F9"/>
+            <w:tcMar>
+              <w:top w:w="100" w:type="dxa"/>
+              <w:bottom w:w="100" w:type="dxa"/>
+              <w:left w:w="150" w:type="dxa"/>
+              <w:right w:w="150" w:type="dxa"/>
+            </w:tcMar>
+          </w:tcPr>
+          <w:p>
+            <w:pPr>
+              <w:spacing w:before="0" w:after="0"/>
+              <w:jc w:val="left"/>
+            </w:pPr>
+            <w:r>
+              <w:rPr>
+                <w:rFonts w:ascii="Arial" w:hAnsi="Arial"/>
+                <w:color w:val="334155"/>
+                <w:sz w:val="18"/>
+              </w:rPr>
+              <w:t>OpenAI Whisper API</w:t>
+            </w:r>
+          </w:p>
+        </w:tc>
+        <w:tc>
+          <w:tcPr>
+            <w:tcW w:type="dxa" w:w="2592"/>
+            <w:shd w:fill="F1F5F9"/>
+            <w:tcMar>
+              <w:top w:w="100" w:type="dxa"/>
+              <w:bottom w:w="100" w:type="dxa"/>
+              <w:left w:w="150" w:type="dxa"/>
+              <w:right w:w="150" w:type="dxa"/>
+            </w:tcMar>
+          </w:tcPr>
+          <w:p>
+            <w:pPr>
+              <w:spacing w:before="0" w:after="0"/>
+              <w:jc w:val="left"/>
+            </w:pPr>
+            <w:r>
+              <w:rPr>
+                <w:rFonts w:ascii="Arial" w:hAnsi="Arial"/>
+                <w:color w:val="334155"/>
+                <w:sz w:val="18"/>
+              </w:rPr>
+              <w:t>~1.5s latency</w:t>
+              <w:br/>
+              <w:t>$0.006 / minute</w:t>
+            </w:r>
+          </w:p>
+        </w:tc>
+        <w:tc>
+          <w:tcPr>
+            <w:tcW w:type="dxa" w:w="2448"/>
+            <w:shd w:fill="F1F5F9"/>
+            <w:tcMar>
+              <w:top w:w="100" w:type="dxa"/>
+              <w:bottom w:w="100" w:type="dxa"/>
+              <w:left w:w="150" w:type="dxa"/>
+              <w:right w:w="150" w:type="dxa"/>
+            </w:tcMar>
+          </w:tcPr>
+          <w:p>
+            <w:pPr>
+              <w:spacing w:before="0" w:after="0"/>
+              <w:jc w:val="left"/>
+            </w:pPr>
+            <w:r>
+              <w:rPr>
+                <w:rFonts w:ascii="Arial" w:hAnsi="Arial"/>
+                <w:color w:val="334155"/>
+                <w:sz w:val="18"/>
+              </w:rPr>
+              <w:t>State-of-the-art multilingual</w:t>
+              <w:br/>
+              <w:t>Excellent with background noise</w:t>
+            </w:r>
+          </w:p>
+        </w:tc>
+        <w:tc>
+          <w:tcPr>
+            <w:tcW w:type="dxa" w:w="2304"/>
+            <w:shd w:fill="F1F5F9"/>
+            <w:tcMar>
+              <w:top w:w="100" w:type="dxa"/>
+              <w:bottom w:w="100" w:type="dxa"/>
+              <w:left w:w="150" w:type="dxa"/>
+              <w:right w:w="150" w:type="dxa"/>
+            </w:tcMar>
+          </w:tcPr>
+          <w:p>
+            <w:pPr>
+              <w:spacing w:before="0" w:after="0"/>
+              <w:jc w:val="left"/>
+            </w:pPr>
+            <w:r>
+              <w:rPr>
+                <w:rFonts w:ascii="Arial" w:hAnsi="Arial"/>
+                <w:color w:val="334155"/>
+                <w:sz w:val="18"/>
+              </w:rPr>
+              <w:t>Audio file uploads (.mp3, .m4a)</w:t>
+              <w:br/>
+              <w:t>WhatsApp voice notes</w:t>
+            </w:r>
+          </w:p>
+        </w:tc>
+      </w:tr>
+      <w:tr>
+        <w:tc>
+          <w:tcPr>
+            <w:tcW w:type="dxa" w:w="2592"/>
+            <w:shd w:fill="FFFFFF"/>
+            <w:tcMar>
+              <w:top w:w="100" w:type="dxa"/>
+              <w:bottom w:w="100" w:type="dxa"/>
+              <w:left w:w="150" w:type="dxa"/>
+              <w:right w:w="150" w:type="dxa"/>
+            </w:tcMar>
+          </w:tcPr>
+          <w:p>
+            <w:pPr>
+              <w:spacing w:before="0" w:after="0"/>
+              <w:jc w:val="left"/>
+            </w:pPr>
+            <w:r>
+              <w:rPr>
+                <w:rFonts w:ascii="Arial" w:hAnsi="Arial"/>
+                <w:color w:val="334155"/>
+                <w:sz w:val="18"/>
+              </w:rPr>
+              <w:t>Google Cloud Speech-to-Text v2</w:t>
+            </w:r>
+          </w:p>
+        </w:tc>
+        <w:tc>
+          <w:tcPr>
+            <w:tcW w:type="dxa" w:w="2592"/>
+            <w:shd w:fill="FFFFFF"/>
+            <w:tcMar>
+              <w:top w:w="100" w:type="dxa"/>
+              <w:bottom w:w="100" w:type="dxa"/>
+              <w:left w:w="150" w:type="dxa"/>
+              <w:right w:w="150" w:type="dxa"/>
+            </w:tcMar>
+          </w:tcPr>
+          <w:p>
+            <w:pPr>
+              <w:spacing w:before="0" w:after="0"/>
+              <w:jc w:val="left"/>
+            </w:pPr>
+            <w:r>
+              <w:rPr>
+                <w:rFonts w:ascii="Arial" w:hAnsi="Arial"/>
+                <w:color w:val="334155"/>
+                <w:sz w:val="18"/>
+              </w:rPr>
+              <w:t>~500ms streaming latency</w:t>
+              <w:br/>
+              <w:t>$0.016 / minute</w:t>
+            </w:r>
+          </w:p>
+        </w:tc>
+        <w:tc>
+          <w:tcPr>
+            <w:tcW w:type="dxa" w:w="2448"/>
+            <w:shd w:fill="FFFFFF"/>
+            <w:tcMar>
+              <w:top w:w="100" w:type="dxa"/>
+              <w:bottom w:w="100" w:type="dxa"/>
+              <w:left w:w="150" w:type="dxa"/>
+              <w:right w:w="150" w:type="dxa"/>
+            </w:tcMar>
+          </w:tcPr>
+          <w:p>
+            <w:pPr>
+              <w:spacing w:before="0" w:after="0"/>
+              <w:jc w:val="left"/>
+            </w:pPr>
+            <w:r>
+              <w:rPr>
+                <w:rFonts w:ascii="Arial" w:hAnsi="Arial"/>
+                <w:color w:val="334155"/>
+                <w:sz w:val="18"/>
+              </w:rPr>
+              <w:t>Exceptional Indian English &amp; Hindi</w:t>
+              <w:br/>
+              <w:t>Industry vocabulary adaptation</w:t>
+            </w:r>
+          </w:p>
+        </w:tc>
+        <w:tc>
+          <w:tcPr>
+            <w:tcW w:type="dxa" w:w="2304"/>
+            <w:shd w:fill="FFFFFF"/>
+            <w:tcMar>
+              <w:top w:w="100" w:type="dxa"/>
+              <w:bottom w:w="100" w:type="dxa"/>
+              <w:left w:w="150" w:type="dxa"/>
+              <w:right w:w="150" w:type="dxa"/>
+            </w:tcMar>
+          </w:tcPr>
+          <w:p>
+            <w:pPr>
+              <w:spacing w:before="0" w:after="0"/>
+              <w:jc w:val="left"/>
+            </w:pPr>
+            <w:r>
+              <w:rPr>
+                <w:rFonts w:ascii="Arial" w:hAnsi="Arial"/>
+                <w:color w:val="334155"/>
+                <w:sz w:val="18"/>
+              </w:rPr>
+              <w:t>Enterprise call center &amp; high-volume quote dictation</w:t>
+            </w:r>
+          </w:p>
+        </w:tc>
+      </w:tr>
+      <w:tr>
+        <w:tc>
+          <w:tcPr>
+            <w:tcW w:type="dxa" w:w="2592"/>
+            <w:shd w:fill="F1F5F9"/>
+            <w:tcMar>
+              <w:top w:w="100" w:type="dxa"/>
+              <w:bottom w:w="100" w:type="dxa"/>
+              <w:left w:w="150" w:type="dxa"/>
+              <w:right w:w="150" w:type="dxa"/>
+            </w:tcMar>
+          </w:tcPr>
+          <w:p>
+            <w:pPr>
+              <w:spacing w:before="0" w:after="0"/>
+              <w:jc w:val="left"/>
+            </w:pPr>
+            <w:r>
+              <w:rPr>
+                <w:rFonts w:ascii="Arial" w:hAnsi="Arial"/>
+                <w:color w:val="334155"/>
+                <w:sz w:val="18"/>
+              </w:rPr>
+              <w:t>Deepgram Nova-2</w:t>
+            </w:r>
+          </w:p>
+        </w:tc>
+        <w:tc>
+          <w:tcPr>
+            <w:tcW w:type="dxa" w:w="2592"/>
+            <w:shd w:fill="F1F5F9"/>
+            <w:tcMar>
+              <w:top w:w="100" w:type="dxa"/>
+              <w:bottom w:w="100" w:type="dxa"/>
+              <w:left w:w="150" w:type="dxa"/>
+              <w:right w:w="150" w:type="dxa"/>
+            </w:tcMar>
+          </w:tcPr>
+          <w:p>
+            <w:pPr>
+              <w:spacing w:before="0" w:after="0"/>
+              <w:jc w:val="left"/>
+            </w:pPr>
+            <w:r>
+              <w:rPr>
+                <w:rFonts w:ascii="Arial" w:hAnsi="Arial"/>
+                <w:color w:val="334155"/>
+                <w:sz w:val="18"/>
+              </w:rPr>
+              <w:t>~300ms streaming latency</w:t>
+              <w:br/>
+              <w:t>$0.0043 / minute</w:t>
+            </w:r>
+          </w:p>
+        </w:tc>
+        <w:tc>
+          <w:tcPr>
+            <w:tcW w:type="dxa" w:w="2448"/>
+            <w:shd w:fill="F1F5F9"/>
+            <w:tcMar>
+              <w:top w:w="100" w:type="dxa"/>
+              <w:bottom w:w="100" w:type="dxa"/>
+              <w:left w:w="150" w:type="dxa"/>
+              <w:right w:w="150" w:type="dxa"/>
+            </w:tcMar>
+          </w:tcPr>
+          <w:p>
+            <w:pPr>
+              <w:spacing w:before="0" w:after="0"/>
+              <w:jc w:val="left"/>
+            </w:pPr>
+            <w:r>
+              <w:rPr>
+                <w:rFonts w:ascii="Arial" w:hAnsi="Arial"/>
+                <w:color w:val="334155"/>
+                <w:sz w:val="18"/>
+              </w:rPr>
+              <w:t>Ultra-fast streaming WebSocket</w:t>
+              <w:br/>
+              <w:t>Specialized number formatting</w:t>
+            </w:r>
+          </w:p>
+        </w:tc>
+        <w:tc>
+          <w:tcPr>
+            <w:tcW w:type="dxa" w:w="2304"/>
+            <w:shd w:fill="F1F5F9"/>
+            <w:tcMar>
+              <w:top w:w="100" w:type="dxa"/>
+              <w:bottom w:w="100" w:type="dxa"/>
+              <w:left w:w="150" w:type="dxa"/>
+              <w:right w:w="150" w:type="dxa"/>
+            </w:tcMar>
+          </w:tcPr>
+          <w:p>
+            <w:pPr>
+              <w:spacing w:before="0" w:after="0"/>
+              <w:jc w:val="left"/>
+            </w:pPr>
+            <w:r>
+              <w:rPr>
+                <w:rFonts w:ascii="Arial" w:hAnsi="Arial"/>
+                <w:color w:val="334155"/>
+                <w:sz w:val="18"/>
+              </w:rPr>
+              <w:t>Live simultaneous speech transcription</w:t>
+            </w:r>
+          </w:p>
+        </w:tc>
+      </w:tr>
+    </w:tbl>
+    <w:p>
+      <w:pPr>
+        <w:spacing w:after="200"/>
+      </w:pPr>
+    </w:p>
+    <w:p>
+      <w:pPr>
         <w:spacing w:before="320" w:after="80"/>
       </w:pPr>
       <w:r>
@@ -3732,7 +4421,7 @@
                 <w:color w:val="FFFFFF"/>
                 <w:sz w:val="19"/>
               </w:rPr>
-              <w:t>Version 1.0</w:t>
+              <w:t>Review 1.0</w:t>
             </w:r>
           </w:p>
         </w:tc>
@@ -3759,7 +4448,7 @@
                 <w:color w:val="FFFFFF"/>
                 <w:sz w:val="19"/>
               </w:rPr>
-              <w:t>Version 2.0</w:t>
+              <w:t>Review 2.0</w:t>
             </w:r>
           </w:p>
         </w:tc>
@@ -3973,7 +4662,7 @@
                 <w:color w:val="334155"/>
                 <w:sz w:val="18"/>
               </w:rPr>
-              <w:t>Dedicated URL Route</w:t>
+              <w:t>Dedicated Git Branch</w:t>
             </w:r>
           </w:p>
         </w:tc>
@@ -3999,7 +4688,7 @@
                 <w:color w:val="334155"/>
                 <w:sz w:val="18"/>
               </w:rPr>
-              <w:t>/#/create-quote</w:t>
+              <w:t>preview1</w:t>
             </w:r>
           </w:p>
         </w:tc>
@@ -4025,7 +4714,7 @@
                 <w:color w:val="334155"/>
                 <w:sz w:val="18"/>
               </w:rPr>
-              <w:t>/#/create-quote</w:t>
+              <w:t>preview2</w:t>
             </w:r>
           </w:p>
         </w:tc>
@@ -4051,6 +4740,138 @@
                 <w:color w:val="334155"/>
                 <w:sz w:val="18"/>
               </w:rPr>
+              <w:t>review3</w:t>
+            </w:r>
+          </w:p>
+        </w:tc>
+        <w:tc>
+          <w:tcPr>
+            <w:tcW w:type="dxa" w:w="1728"/>
+            <w:shd w:fill="F1F5F9"/>
+            <w:tcMar>
+              <w:top w:w="100" w:type="dxa"/>
+              <w:bottom w:w="100" w:type="dxa"/>
+              <w:left w:w="150" w:type="dxa"/>
+              <w:right w:w="150" w:type="dxa"/>
+            </w:tcMar>
+          </w:tcPr>
+          <w:p>
+            <w:pPr>
+              <w:spacing w:before="0" w:after="0"/>
+              <w:jc w:val="left"/>
+            </w:pPr>
+            <w:r>
+              <w:rPr>
+                <w:rFonts w:ascii="Arial" w:hAnsi="Arial"/>
+                <w:color w:val="334155"/>
+                <w:sz w:val="18"/>
+              </w:rPr>
+              <w:t>review4 (Separate)</w:t>
+            </w:r>
+          </w:p>
+        </w:tc>
+      </w:tr>
+      <w:tr>
+        <w:tc>
+          <w:tcPr>
+            <w:tcW w:type="dxa" w:w="3312"/>
+            <w:shd w:fill="FFFFFF"/>
+            <w:tcMar>
+              <w:top w:w="100" w:type="dxa"/>
+              <w:bottom w:w="100" w:type="dxa"/>
+              <w:left w:w="150" w:type="dxa"/>
+              <w:right w:w="150" w:type="dxa"/>
+            </w:tcMar>
+          </w:tcPr>
+          <w:p>
+            <w:pPr>
+              <w:spacing w:before="0" w:after="0"/>
+              <w:jc w:val="left"/>
+            </w:pPr>
+            <w:r>
+              <w:rPr>
+                <w:rFonts w:ascii="Arial" w:hAnsi="Arial"/>
+                <w:color w:val="334155"/>
+                <w:sz w:val="18"/>
+              </w:rPr>
+              <w:t>Dedicated URL Route</w:t>
+            </w:r>
+          </w:p>
+        </w:tc>
+        <w:tc>
+          <w:tcPr>
+            <w:tcW w:type="dxa" w:w="1584"/>
+            <w:shd w:fill="FFFFFF"/>
+            <w:tcMar>
+              <w:top w:w="100" w:type="dxa"/>
+              <w:bottom w:w="100" w:type="dxa"/>
+              <w:left w:w="150" w:type="dxa"/>
+              <w:right w:w="150" w:type="dxa"/>
+            </w:tcMar>
+          </w:tcPr>
+          <w:p>
+            <w:pPr>
+              <w:spacing w:before="0" w:after="0"/>
+              <w:jc w:val="left"/>
+            </w:pPr>
+            <w:r>
+              <w:rPr>
+                <w:rFonts w:ascii="Arial" w:hAnsi="Arial"/>
+                <w:color w:val="334155"/>
+                <w:sz w:val="18"/>
+              </w:rPr>
+              <w:t>/#/create-quote</w:t>
+            </w:r>
+          </w:p>
+        </w:tc>
+        <w:tc>
+          <w:tcPr>
+            <w:tcW w:type="dxa" w:w="1584"/>
+            <w:shd w:fill="FFFFFF"/>
+            <w:tcMar>
+              <w:top w:w="100" w:type="dxa"/>
+              <w:bottom w:w="100" w:type="dxa"/>
+              <w:left w:w="150" w:type="dxa"/>
+              <w:right w:w="150" w:type="dxa"/>
+            </w:tcMar>
+          </w:tcPr>
+          <w:p>
+            <w:pPr>
+              <w:spacing w:before="0" w:after="0"/>
+              <w:jc w:val="left"/>
+            </w:pPr>
+            <w:r>
+              <w:rPr>
+                <w:rFonts w:ascii="Arial" w:hAnsi="Arial"/>
+                <w:color w:val="334155"/>
+                <w:sz w:val="18"/>
+              </w:rPr>
+              <w:t>/#/create-quote</w:t>
+            </w:r>
+          </w:p>
+        </w:tc>
+        <w:tc>
+          <w:tcPr>
+            <w:tcW w:type="dxa" w:w="1728"/>
+            <w:shd w:fill="FFFFFF"/>
+            <w:tcMar>
+              <w:top w:w="100" w:type="dxa"/>
+              <w:bottom w:w="100" w:type="dxa"/>
+              <w:left w:w="150" w:type="dxa"/>
+              <w:right w:w="150" w:type="dxa"/>
+            </w:tcMar>
+          </w:tcPr>
+          <w:p>
+            <w:pPr>
+              <w:spacing w:before="0" w:after="0"/>
+              <w:jc w:val="left"/>
+            </w:pPr>
+            <w:r>
+              <w:rPr>
+                <w:rFonts w:ascii="Arial" w:hAnsi="Arial"/>
+                <w:color w:val="334155"/>
+                <w:sz w:val="18"/>
+              </w:rPr>
               <w:t>/#/create-quote2</w:t>
             </w:r>
           </w:p>
@@ -4058,7 +4879,7 @@
         <w:tc>
           <w:tcPr>
             <w:tcW w:type="dxa" w:w="1728"/>
-            <w:shd w:fill="F1F5F9"/>
+            <w:shd w:fill="FFFFFF"/>
             <w:tcMar>
               <w:top w:w="100" w:type="dxa"/>
               <w:bottom w:w="100" w:type="dxa"/>
@@ -4086,7 +4907,7 @@
         <w:tc>
           <w:tcPr>
             <w:tcW w:type="dxa" w:w="3312"/>
-            <w:shd w:fill="FFFFFF"/>
+            <w:shd w:fill="F1F5F9"/>
             <w:tcMar>
               <w:top w:w="100" w:type="dxa"/>
               <w:bottom w:w="100" w:type="dxa"/>
@@ -4112,7 +4933,7 @@
         <w:tc>
           <w:tcPr>
             <w:tcW w:type="dxa" w:w="1584"/>
-            <w:shd w:fill="FFFFFF"/>
+            <w:shd w:fill="F1F5F9"/>
             <w:tcMar>
               <w:top w:w="100" w:type="dxa"/>
               <w:bottom w:w="100" w:type="dxa"/>
@@ -4138,7 +4959,7 @@
         <w:tc>
           <w:tcPr>
             <w:tcW w:type="dxa" w:w="1584"/>
-            <w:shd w:fill="FFFFFF"/>
+            <w:shd w:fill="F1F5F9"/>
             <w:tcMar>
               <w:top w:w="100" w:type="dxa"/>
               <w:bottom w:w="100" w:type="dxa"/>
@@ -4164,7 +4985,7 @@
         <w:tc>
           <w:tcPr>
             <w:tcW w:type="dxa" w:w="1728"/>
-            <w:shd w:fill="FFFFFF"/>
+            <w:shd w:fill="F1F5F9"/>
             <w:tcMar>
               <w:top w:w="100" w:type="dxa"/>
               <w:bottom w:w="100" w:type="dxa"/>
@@ -4190,7 +5011,7 @@
         <w:tc>
           <w:tcPr>
             <w:tcW w:type="dxa" w:w="1728"/>
-            <w:shd w:fill="FFFFFF"/>
+            <w:shd w:fill="F1F5F9"/>
             <w:tcMar>
               <w:top w:w="100" w:type="dxa"/>
               <w:bottom w:w="100" w:type="dxa"/>
@@ -4218,6 +5039,138 @@
         <w:tc>
           <w:tcPr>
             <w:tcW w:type="dxa" w:w="3312"/>
+            <w:shd w:fill="FFFFFF"/>
+            <w:tcMar>
+              <w:top w:w="100" w:type="dxa"/>
+              <w:bottom w:w="100" w:type="dxa"/>
+              <w:left w:w="150" w:type="dxa"/>
+              <w:right w:w="150" w:type="dxa"/>
+            </w:tcMar>
+          </w:tcPr>
+          <w:p>
+            <w:pPr>
+              <w:spacing w:before="0" w:after="0"/>
+              <w:jc w:val="left"/>
+            </w:pPr>
+            <w:r>
+              <w:rPr>
+                <w:rFonts w:ascii="Arial" w:hAnsi="Arial"/>
+                <w:color w:val="334155"/>
+                <w:sz w:val="18"/>
+              </w:rPr>
+              <w:t>Live Audio Dictation (Mic)</w:t>
+            </w:r>
+          </w:p>
+        </w:tc>
+        <w:tc>
+          <w:tcPr>
+            <w:tcW w:type="dxa" w:w="1584"/>
+            <w:shd w:fill="FFFFFF"/>
+            <w:tcMar>
+              <w:top w:w="100" w:type="dxa"/>
+              <w:bottom w:w="100" w:type="dxa"/>
+              <w:left w:w="150" w:type="dxa"/>
+              <w:right w:w="150" w:type="dxa"/>
+            </w:tcMar>
+          </w:tcPr>
+          <w:p>
+            <w:pPr>
+              <w:spacing w:before="0" w:after="0"/>
+              <w:jc w:val="left"/>
+            </w:pPr>
+            <w:r>
+              <w:rPr>
+                <w:rFonts w:ascii="Arial" w:hAnsi="Arial"/>
+                <w:color w:val="334155"/>
+                <w:sz w:val="18"/>
+              </w:rPr>
+              <w:t>Not available</w:t>
+            </w:r>
+          </w:p>
+        </w:tc>
+        <w:tc>
+          <w:tcPr>
+            <w:tcW w:type="dxa" w:w="1584"/>
+            <w:shd w:fill="FFFFFF"/>
+            <w:tcMar>
+              <w:top w:w="100" w:type="dxa"/>
+              <w:bottom w:w="100" w:type="dxa"/>
+              <w:left w:w="150" w:type="dxa"/>
+              <w:right w:w="150" w:type="dxa"/>
+            </w:tcMar>
+          </w:tcPr>
+          <w:p>
+            <w:pPr>
+              <w:spacing w:before="0" w:after="0"/>
+              <w:jc w:val="left"/>
+            </w:pPr>
+            <w:r>
+              <w:rPr>
+                <w:rFonts w:ascii="Arial" w:hAnsi="Arial"/>
+                <w:color w:val="334155"/>
+                <w:sz w:val="18"/>
+              </w:rPr>
+              <w:t>Basic dialog</w:t>
+            </w:r>
+          </w:p>
+        </w:tc>
+        <w:tc>
+          <w:tcPr>
+            <w:tcW w:type="dxa" w:w="1728"/>
+            <w:shd w:fill="FFFFFF"/>
+            <w:tcMar>
+              <w:top w:w="100" w:type="dxa"/>
+              <w:bottom w:w="100" w:type="dxa"/>
+              <w:left w:w="150" w:type="dxa"/>
+              <w:right w:w="150" w:type="dxa"/>
+            </w:tcMar>
+          </w:tcPr>
+          <w:p>
+            <w:pPr>
+              <w:spacing w:before="0" w:after="0"/>
+              <w:jc w:val="left"/>
+            </w:pPr>
+            <w:r>
+              <w:rPr>
+                <w:rFonts w:ascii="Arial" w:hAnsi="Arial"/>
+                <w:color w:val="334155"/>
+                <w:sz w:val="18"/>
+              </w:rPr>
+              <w:t>Basic dialog</w:t>
+            </w:r>
+          </w:p>
+        </w:tc>
+        <w:tc>
+          <w:tcPr>
+            <w:tcW w:type="dxa" w:w="1728"/>
+            <w:shd w:fill="FFFFFF"/>
+            <w:tcMar>
+              <w:top w:w="100" w:type="dxa"/>
+              <w:bottom w:w="100" w:type="dxa"/>
+              <w:left w:w="150" w:type="dxa"/>
+              <w:right w:w="150" w:type="dxa"/>
+            </w:tcMar>
+          </w:tcPr>
+          <w:p>
+            <w:pPr>
+              <w:spacing w:before="0" w:after="0"/>
+              <w:jc w:val="left"/>
+            </w:pPr>
+            <w:r>
+              <w:rPr>
+                <w:rFonts w:ascii="Arial" w:hAnsi="Arial"/>
+                <w:color w:val="334155"/>
+                <w:sz w:val="18"/>
+              </w:rPr>
+              <w:t>Dedicated Waveform Studio</w:t>
+            </w:r>
+          </w:p>
+        </w:tc>
+      </w:tr>
+      <w:tr>
+        <w:tc>
+          <w:tcPr>
+            <w:tcW w:type="dxa" w:w="3312"/>
             <w:shd w:fill="F1F5F9"/>
             <w:tcMar>
               <w:top w:w="100" w:type="dxa"/>
@@ -4237,7 +5190,7 @@
                 <w:color w:val="334155"/>
                 <w:sz w:val="18"/>
               </w:rPr>
-              <w:t>Live Audio Dictation (Mic)</w:t>
+              <w:t>Audio File Upload (.mp3)</w:t>
             </w:r>
           </w:p>
         </w:tc>
@@ -4289,7 +5242,7 @@
                 <w:color w:val="334155"/>
                 <w:sz w:val="18"/>
               </w:rPr>
-              <w:t>Basic dialog</w:t>
+              <w:t>Not available</w:t>
             </w:r>
           </w:p>
         </w:tc>
@@ -4315,7 +5268,7 @@
                 <w:color w:val="334155"/>
                 <w:sz w:val="18"/>
               </w:rPr>
-              <w:t>Basic dialog</w:t>
+              <w:t>Not available</w:t>
             </w:r>
           </w:p>
         </w:tc>
@@ -4341,7 +5294,7 @@
                 <w:color w:val="334155"/>
                 <w:sz w:val="18"/>
               </w:rPr>
-              <w:t>Dedicated Waveform Studio</w:t>
+              <w:t>Included (Dropzone)</w:t>
             </w:r>
           </w:p>
         </w:tc>
@@ -4369,7 +5322,271 @@
                 <w:color w:val="334155"/>
                 <w:sz w:val="18"/>
               </w:rPr>
-              <w:t>Audio File Upload (.mp3)</w:t>
+              <w:t>Spoken Word Number Parser</w:t>
+            </w:r>
+          </w:p>
+        </w:tc>
+        <w:tc>
+          <w:tcPr>
+            <w:tcW w:type="dxa" w:w="1584"/>
+            <w:shd w:fill="FFFFFF"/>
+            <w:tcMar>
+              <w:top w:w="100" w:type="dxa"/>
+              <w:bottom w:w="100" w:type="dxa"/>
+              <w:left w:w="150" w:type="dxa"/>
+              <w:right w:w="150" w:type="dxa"/>
+            </w:tcMar>
+          </w:tcPr>
+          <w:p>
+            <w:pPr>
+              <w:spacing w:before="0" w:after="0"/>
+              <w:jc w:val="left"/>
+            </w:pPr>
+            <w:r>
+              <w:rPr>
+                <w:rFonts w:ascii="Arial" w:hAnsi="Arial"/>
+                <w:color w:val="334155"/>
+                <w:sz w:val="18"/>
+              </w:rPr>
+              <w:t>Not available</w:t>
+            </w:r>
+          </w:p>
+        </w:tc>
+        <w:tc>
+          <w:tcPr>
+            <w:tcW w:type="dxa" w:w="1584"/>
+            <w:shd w:fill="FFFFFF"/>
+            <w:tcMar>
+              <w:top w:w="100" w:type="dxa"/>
+              <w:bottom w:w="100" w:type="dxa"/>
+              <w:left w:w="150" w:type="dxa"/>
+              <w:right w:w="150" w:type="dxa"/>
+            </w:tcMar>
+          </w:tcPr>
+          <w:p>
+            <w:pPr>
+              <w:spacing w:before="0" w:after="0"/>
+              <w:jc w:val="left"/>
+            </w:pPr>
+            <w:r>
+              <w:rPr>
+                <w:rFonts w:ascii="Arial" w:hAnsi="Arial"/>
+                <w:color w:val="334155"/>
+                <w:sz w:val="18"/>
+              </w:rPr>
+              <w:t>Digits only</w:t>
+            </w:r>
+          </w:p>
+        </w:tc>
+        <w:tc>
+          <w:tcPr>
+            <w:tcW w:type="dxa" w:w="1728"/>
+            <w:shd w:fill="FFFFFF"/>
+            <w:tcMar>
+              <w:top w:w="100" w:type="dxa"/>
+              <w:bottom w:w="100" w:type="dxa"/>
+              <w:left w:w="150" w:type="dxa"/>
+              <w:right w:w="150" w:type="dxa"/>
+            </w:tcMar>
+          </w:tcPr>
+          <w:p>
+            <w:pPr>
+              <w:spacing w:before="0" w:after="0"/>
+              <w:jc w:val="left"/>
+            </w:pPr>
+            <w:r>
+              <w:rPr>
+                <w:rFonts w:ascii="Arial" w:hAnsi="Arial"/>
+                <w:color w:val="334155"/>
+                <w:sz w:val="18"/>
+              </w:rPr>
+              <w:t>Digits only</w:t>
+            </w:r>
+          </w:p>
+        </w:tc>
+        <w:tc>
+          <w:tcPr>
+            <w:tcW w:type="dxa" w:w="1728"/>
+            <w:shd w:fill="FFFFFF"/>
+            <w:tcMar>
+              <w:top w:w="100" w:type="dxa"/>
+              <w:bottom w:w="100" w:type="dxa"/>
+              <w:left w:w="150" w:type="dxa"/>
+              <w:right w:w="150" w:type="dxa"/>
+            </w:tcMar>
+          </w:tcPr>
+          <w:p>
+            <w:pPr>
+              <w:spacing w:before="0" w:after="0"/>
+              <w:jc w:val="left"/>
+            </w:pPr>
+            <w:r>
+              <w:rPr>
+                <w:rFonts w:ascii="Arial" w:hAnsi="Arial"/>
+                <w:color w:val="334155"/>
+                <w:sz w:val="18"/>
+              </w:rPr>
+              <w:t>Full ('twenty five thousand')</w:t>
+            </w:r>
+          </w:p>
+        </w:tc>
+      </w:tr>
+      <w:tr>
+        <w:tc>
+          <w:tcPr>
+            <w:tcW w:type="dxa" w:w="3312"/>
+            <w:shd w:fill="F1F5F9"/>
+            <w:tcMar>
+              <w:top w:w="100" w:type="dxa"/>
+              <w:bottom w:w="100" w:type="dxa"/>
+              <w:left w:w="150" w:type="dxa"/>
+              <w:right w:w="150" w:type="dxa"/>
+            </w:tcMar>
+          </w:tcPr>
+          <w:p>
+            <w:pPr>
+              <w:spacing w:before="0" w:after="0"/>
+              <w:jc w:val="left"/>
+            </w:pPr>
+            <w:r>
+              <w:rPr>
+                <w:rFonts w:ascii="Arial" w:hAnsi="Arial"/>
+                <w:color w:val="334155"/>
+                <w:sz w:val="18"/>
+              </w:rPr>
+              <w:t>1-Click Invoice Conversion</w:t>
+            </w:r>
+          </w:p>
+        </w:tc>
+        <w:tc>
+          <w:tcPr>
+            <w:tcW w:type="dxa" w:w="1584"/>
+            <w:shd w:fill="F1F5F9"/>
+            <w:tcMar>
+              <w:top w:w="100" w:type="dxa"/>
+              <w:bottom w:w="100" w:type="dxa"/>
+              <w:left w:w="150" w:type="dxa"/>
+              <w:right w:w="150" w:type="dxa"/>
+            </w:tcMar>
+          </w:tcPr>
+          <w:p>
+            <w:pPr>
+              <w:spacing w:before="0" w:after="0"/>
+              <w:jc w:val="left"/>
+            </w:pPr>
+            <w:r>
+              <w:rPr>
+                <w:rFonts w:ascii="Arial" w:hAnsi="Arial"/>
+                <w:color w:val="334155"/>
+                <w:sz w:val="18"/>
+              </w:rPr>
+              <w:t>Manual entry</w:t>
+            </w:r>
+          </w:p>
+        </w:tc>
+        <w:tc>
+          <w:tcPr>
+            <w:tcW w:type="dxa" w:w="1584"/>
+            <w:shd w:fill="F1F5F9"/>
+            <w:tcMar>
+              <w:top w:w="100" w:type="dxa"/>
+              <w:bottom w:w="100" w:type="dxa"/>
+              <w:left w:w="150" w:type="dxa"/>
+              <w:right w:w="150" w:type="dxa"/>
+            </w:tcMar>
+          </w:tcPr>
+          <w:p>
+            <w:pPr>
+              <w:spacing w:before="0" w:after="0"/>
+              <w:jc w:val="left"/>
+            </w:pPr>
+            <w:r>
+              <w:rPr>
+                <w:rFonts w:ascii="Arial" w:hAnsi="Arial"/>
+                <w:color w:val="334155"/>
+                <w:sz w:val="18"/>
+              </w:rPr>
+              <w:t>1-Click Auto-Map</w:t>
+            </w:r>
+          </w:p>
+        </w:tc>
+        <w:tc>
+          <w:tcPr>
+            <w:tcW w:type="dxa" w:w="1728"/>
+            <w:shd w:fill="F1F5F9"/>
+            <w:tcMar>
+              <w:top w:w="100" w:type="dxa"/>
+              <w:bottom w:w="100" w:type="dxa"/>
+              <w:left w:w="150" w:type="dxa"/>
+              <w:right w:w="150" w:type="dxa"/>
+            </w:tcMar>
+          </w:tcPr>
+          <w:p>
+            <w:pPr>
+              <w:spacing w:before="0" w:after="0"/>
+              <w:jc w:val="left"/>
+            </w:pPr>
+            <w:r>
+              <w:rPr>
+                <w:rFonts w:ascii="Arial" w:hAnsi="Arial"/>
+                <w:color w:val="334155"/>
+                <w:sz w:val="18"/>
+              </w:rPr>
+              <w:t>1-Click Auto-Map</w:t>
+            </w:r>
+          </w:p>
+        </w:tc>
+        <w:tc>
+          <w:tcPr>
+            <w:tcW w:type="dxa" w:w="1728"/>
+            <w:shd w:fill="F1F5F9"/>
+            <w:tcMar>
+              <w:top w:w="100" w:type="dxa"/>
+              <w:bottom w:w="100" w:type="dxa"/>
+              <w:left w:w="150" w:type="dxa"/>
+              <w:right w:w="150" w:type="dxa"/>
+            </w:tcMar>
+          </w:tcPr>
+          <w:p>
+            <w:pPr>
+              <w:spacing w:before="0" w:after="0"/>
+              <w:jc w:val="left"/>
+            </w:pPr>
+            <w:r>
+              <w:rPr>
+                <w:rFonts w:ascii="Arial" w:hAnsi="Arial"/>
+                <w:color w:val="334155"/>
+                <w:sz w:val="18"/>
+              </w:rPr>
+              <w:t>1-Click Direct Pipeline</w:t>
+            </w:r>
+          </w:p>
+        </w:tc>
+      </w:tr>
+      <w:tr>
+        <w:tc>
+          <w:tcPr>
+            <w:tcW w:type="dxa" w:w="3312"/>
+            <w:shd w:fill="FFFFFF"/>
+            <w:tcMar>
+              <w:top w:w="100" w:type="dxa"/>
+              <w:bottom w:w="100" w:type="dxa"/>
+              <w:left w:w="150" w:type="dxa"/>
+              <w:right w:w="150" w:type="dxa"/>
+            </w:tcMar>
+          </w:tcPr>
+          <w:p>
+            <w:pPr>
+              <w:spacing w:before="0" w:after="0"/>
+              <w:jc w:val="left"/>
+            </w:pPr>
+            <w:r>
+              <w:rPr>
+                <w:rFonts w:ascii="Arial" w:hAnsi="Arial"/>
+                <w:color w:val="334155"/>
+                <w:sz w:val="18"/>
+              </w:rPr>
+              <w:t>Shipping Details Sub-module</w:t>
             </w:r>
           </w:p>
         </w:tc>
@@ -4447,7 +5664,7 @@
                 <w:color w:val="334155"/>
                 <w:sz w:val="18"/>
               </w:rPr>
-              <w:t>Not available</w:t>
+              <w:t>Included (5 Fields)</w:t>
             </w:r>
           </w:p>
         </w:tc>
@@ -4473,7 +5690,7 @@
                 <w:color w:val="334155"/>
                 <w:sz w:val="18"/>
               </w:rPr>
-              <w:t>Included (Dropzone)</w:t>
+              <w:t>Not needed on /page2</w:t>
             </w:r>
           </w:p>
         </w:tc>
@@ -4501,7 +5718,7 @@
                 <w:color w:val="334155"/>
                 <w:sz w:val="18"/>
               </w:rPr>
-              <w:t>Spoken Word Number Parser</w:t>
+              <w:t>GST / Tax Config Modal</w:t>
             </w:r>
           </w:p>
         </w:tc>
@@ -4527,7 +5744,7 @@
                 <w:color w:val="334155"/>
                 <w:sz w:val="18"/>
               </w:rPr>
-              <w:t>Not available</w:t>
+              <w:t>Standard Tax %</w:t>
             </w:r>
           </w:p>
         </w:tc>
@@ -4553,7 +5770,7 @@
                 <w:color w:val="334155"/>
                 <w:sz w:val="18"/>
               </w:rPr>
-              <w:t>Digits only</w:t>
+              <w:t>Standard Tax %</w:t>
             </w:r>
           </w:p>
         </w:tc>
@@ -4579,7 +5796,7 @@
                 <w:color w:val="334155"/>
                 <w:sz w:val="18"/>
               </w:rPr>
-              <w:t>Digits only</w:t>
+              <w:t>Full Refrens Modal</w:t>
             </w:r>
           </w:p>
         </w:tc>
@@ -4605,7 +5822,7 @@
                 <w:color w:val="334155"/>
                 <w:sz w:val="18"/>
               </w:rPr>
-              <w:t>Full ('twenty five thousand')</w:t>
+              <w:t>Configurable Tax %</w:t>
             </w:r>
           </w:p>
         </w:tc>
@@ -4633,7 +5850,7 @@
                 <w:color w:val="334155"/>
                 <w:sz w:val="18"/>
               </w:rPr>
-              <w:t>1-Click Invoice Conversion</w:t>
+              <w:t>Custom Columns &amp; Formulas</w:t>
             </w:r>
           </w:p>
         </w:tc>
@@ -4659,7 +5876,7 @@
                 <w:color w:val="334155"/>
                 <w:sz w:val="18"/>
               </w:rPr>
-              <w:t>Manual entry</w:t>
+              <w:t>Fixed columns</w:t>
             </w:r>
           </w:p>
         </w:tc>
@@ -4685,7 +5902,7 @@
                 <w:color w:val="334155"/>
                 <w:sz w:val="18"/>
               </w:rPr>
-              <w:t>1-Click Auto-Map</w:t>
+              <w:t>Fixed columns</w:t>
             </w:r>
           </w:p>
         </w:tc>
@@ -4711,7 +5928,7 @@
                 <w:color w:val="334155"/>
                 <w:sz w:val="18"/>
               </w:rPr>
-              <w:t>1-Click Auto-Map</w:t>
+              <w:t>Dynamic Customizer</w:t>
             </w:r>
           </w:p>
         </w:tc>
@@ -4737,7 +5954,7 @@
                 <w:color w:val="334155"/>
                 <w:sz w:val="18"/>
               </w:rPr>
-              <w:t>1-Click Direct Pipeline</w:t>
+              <w:t>Clean Standard Columns</w:t>
             </w:r>
           </w:p>
         </w:tc>
@@ -4765,7 +5982,7 @@
                 <w:color w:val="334155"/>
                 <w:sz w:val="18"/>
               </w:rPr>
-              <w:t>Shipping Details Sub-module</w:t>
+              <w:t>Document Print &amp; PDF Export</w:t>
             </w:r>
           </w:p>
         </w:tc>
@@ -4791,7 +6008,7 @@
                 <w:color w:val="334155"/>
                 <w:sz w:val="18"/>
               </w:rPr>
-              <w:t>Not available</w:t>
+              <w:t>Basic</w:t>
             </w:r>
           </w:p>
         </w:tc>
@@ -4817,7 +6034,7 @@
                 <w:color w:val="334155"/>
                 <w:sz w:val="18"/>
               </w:rPr>
-              <w:t>Not available</w:t>
+              <w:t>Formatted Modal</w:t>
             </w:r>
           </w:p>
         </w:tc>
@@ -4843,7 +6060,7 @@
                 <w:color w:val="334155"/>
                 <w:sz w:val="18"/>
               </w:rPr>
-              <w:t>Included (5 Fields)</w:t>
+              <w:t>Formatted Modal</w:t>
             </w:r>
           </w:p>
         </w:tc>
@@ -4869,7 +6086,7 @@
                 <w:color w:val="334155"/>
                 <w:sz w:val="18"/>
               </w:rPr>
-              <w:t>Not needed on /page2</w:t>
+              <w:t>Instant Print &amp; PDF Modal</w:t>
             </w:r>
           </w:p>
         </w:tc>
@@ -4897,7 +6114,7 @@
                 <w:color w:val="334155"/>
                 <w:sz w:val="18"/>
               </w:rPr>
-              <w:t>GST / Tax Config Modal</w:t>
+              <w:t>Code Merging Status</w:t>
             </w:r>
           </w:p>
         </w:tc>
@@ -4923,7 +6140,7 @@
                 <w:color w:val="334155"/>
                 <w:sz w:val="18"/>
               </w:rPr>
-              <w:t>Standard Tax %</w:t>
+              <w:t>Independent</w:t>
             </w:r>
           </w:p>
         </w:tc>
@@ -4949,7 +6166,7 @@
                 <w:color w:val="334155"/>
                 <w:sz w:val="18"/>
               </w:rPr>
-              <w:t>Standard Tax %</w:t>
+              <w:t>Independent</w:t>
             </w:r>
           </w:p>
         </w:tc>
@@ -4975,7 +6192,7 @@
                 <w:color w:val="334155"/>
                 <w:sz w:val="18"/>
               </w:rPr>
-              <w:t>Full Refrens Modal</w:t>
+              <w:t>Independent</w:t>
             </w:r>
           </w:p>
         </w:tc>
@@ -5001,403 +6218,7 @@
                 <w:color w:val="334155"/>
                 <w:sz w:val="18"/>
               </w:rPr>
-              <w:t>Configurable Tax %</w:t>
-            </w:r>
-          </w:p>
-        </w:tc>
-      </w:tr>
-      <w:tr>
-        <w:tc>
-          <w:tcPr>
-            <w:tcW w:type="dxa" w:w="3312"/>
-            <w:shd w:fill="F1F5F9"/>
-            <w:tcMar>
-              <w:top w:w="100" w:type="dxa"/>
-              <w:bottom w:w="100" w:type="dxa"/>
-              <w:left w:w="150" w:type="dxa"/>
-              <w:right w:w="150" w:type="dxa"/>
-            </w:tcMar>
-          </w:tcPr>
-          <w:p>
-            <w:pPr>
-              <w:spacing w:before="0" w:after="0"/>
-              <w:jc w:val="left"/>
-            </w:pPr>
-            <w:r>
-              <w:rPr>
-                <w:rFonts w:ascii="Arial" w:hAnsi="Arial"/>
-                <w:color w:val="334155"/>
-                <w:sz w:val="18"/>
-              </w:rPr>
-              <w:t>Custom Columns &amp; Formulas</w:t>
-            </w:r>
-          </w:p>
-        </w:tc>
-        <w:tc>
-          <w:tcPr>
-            <w:tcW w:type="dxa" w:w="1584"/>
-            <w:shd w:fill="F1F5F9"/>
-            <w:tcMar>
-              <w:top w:w="100" w:type="dxa"/>
-              <w:bottom w:w="100" w:type="dxa"/>
-              <w:left w:w="150" w:type="dxa"/>
-              <w:right w:w="150" w:type="dxa"/>
-            </w:tcMar>
-          </w:tcPr>
-          <w:p>
-            <w:pPr>
-              <w:spacing w:before="0" w:after="0"/>
-              <w:jc w:val="left"/>
-            </w:pPr>
-            <w:r>
-              <w:rPr>
-                <w:rFonts w:ascii="Arial" w:hAnsi="Arial"/>
-                <w:color w:val="334155"/>
-                <w:sz w:val="18"/>
-              </w:rPr>
-              <w:t>Fixed columns</w:t>
-            </w:r>
-          </w:p>
-        </w:tc>
-        <w:tc>
-          <w:tcPr>
-            <w:tcW w:type="dxa" w:w="1584"/>
-            <w:shd w:fill="F1F5F9"/>
-            <w:tcMar>
-              <w:top w:w="100" w:type="dxa"/>
-              <w:bottom w:w="100" w:type="dxa"/>
-              <w:left w:w="150" w:type="dxa"/>
-              <w:right w:w="150" w:type="dxa"/>
-            </w:tcMar>
-          </w:tcPr>
-          <w:p>
-            <w:pPr>
-              <w:spacing w:before="0" w:after="0"/>
-              <w:jc w:val="left"/>
-            </w:pPr>
-            <w:r>
-              <w:rPr>
-                <w:rFonts w:ascii="Arial" w:hAnsi="Arial"/>
-                <w:color w:val="334155"/>
-                <w:sz w:val="18"/>
-              </w:rPr>
-              <w:t>Fixed columns</w:t>
-            </w:r>
-          </w:p>
-        </w:tc>
-        <w:tc>
-          <w:tcPr>
-            <w:tcW w:type="dxa" w:w="1728"/>
-            <w:shd w:fill="F1F5F9"/>
-            <w:tcMar>
-              <w:top w:w="100" w:type="dxa"/>
-              <w:bottom w:w="100" w:type="dxa"/>
-              <w:left w:w="150" w:type="dxa"/>
-              <w:right w:w="150" w:type="dxa"/>
-            </w:tcMar>
-          </w:tcPr>
-          <w:p>
-            <w:pPr>
-              <w:spacing w:before="0" w:after="0"/>
-              <w:jc w:val="left"/>
-            </w:pPr>
-            <w:r>
-              <w:rPr>
-                <w:rFonts w:ascii="Arial" w:hAnsi="Arial"/>
-                <w:color w:val="334155"/>
-                <w:sz w:val="18"/>
-              </w:rPr>
-              <w:t>Dynamic Customizer</w:t>
-            </w:r>
-          </w:p>
-        </w:tc>
-        <w:tc>
-          <w:tcPr>
-            <w:tcW w:type="dxa" w:w="1728"/>
-            <w:shd w:fill="F1F5F9"/>
-            <w:tcMar>
-              <w:top w:w="100" w:type="dxa"/>
-              <w:bottom w:w="100" w:type="dxa"/>
-              <w:left w:w="150" w:type="dxa"/>
-              <w:right w:w="150" w:type="dxa"/>
-            </w:tcMar>
-          </w:tcPr>
-          <w:p>
-            <w:pPr>
-              <w:spacing w:before="0" w:after="0"/>
-              <w:jc w:val="left"/>
-            </w:pPr>
-            <w:r>
-              <w:rPr>
-                <w:rFonts w:ascii="Arial" w:hAnsi="Arial"/>
-                <w:color w:val="334155"/>
-                <w:sz w:val="18"/>
-              </w:rPr>
-              <w:t>Clean Standard Columns</w:t>
-            </w:r>
-          </w:p>
-        </w:tc>
-      </w:tr>
-      <w:tr>
-        <w:tc>
-          <w:tcPr>
-            <w:tcW w:type="dxa" w:w="3312"/>
-            <w:shd w:fill="FFFFFF"/>
-            <w:tcMar>
-              <w:top w:w="100" w:type="dxa"/>
-              <w:bottom w:w="100" w:type="dxa"/>
-              <w:left w:w="150" w:type="dxa"/>
-              <w:right w:w="150" w:type="dxa"/>
-            </w:tcMar>
-          </w:tcPr>
-          <w:p>
-            <w:pPr>
-              <w:spacing w:before="0" w:after="0"/>
-              <w:jc w:val="left"/>
-            </w:pPr>
-            <w:r>
-              <w:rPr>
-                <w:rFonts w:ascii="Arial" w:hAnsi="Arial"/>
-                <w:color w:val="334155"/>
-                <w:sz w:val="18"/>
-              </w:rPr>
-              <w:t>Document Print &amp; PDF Export</w:t>
-            </w:r>
-          </w:p>
-        </w:tc>
-        <w:tc>
-          <w:tcPr>
-            <w:tcW w:type="dxa" w:w="1584"/>
-            <w:shd w:fill="FFFFFF"/>
-            <w:tcMar>
-              <w:top w:w="100" w:type="dxa"/>
-              <w:bottom w:w="100" w:type="dxa"/>
-              <w:left w:w="150" w:type="dxa"/>
-              <w:right w:w="150" w:type="dxa"/>
-            </w:tcMar>
-          </w:tcPr>
-          <w:p>
-            <w:pPr>
-              <w:spacing w:before="0" w:after="0"/>
-              <w:jc w:val="left"/>
-            </w:pPr>
-            <w:r>
-              <w:rPr>
-                <w:rFonts w:ascii="Arial" w:hAnsi="Arial"/>
-                <w:color w:val="334155"/>
-                <w:sz w:val="18"/>
-              </w:rPr>
-              <w:t>Basic</w:t>
-            </w:r>
-          </w:p>
-        </w:tc>
-        <w:tc>
-          <w:tcPr>
-            <w:tcW w:type="dxa" w:w="1584"/>
-            <w:shd w:fill="FFFFFF"/>
-            <w:tcMar>
-              <w:top w:w="100" w:type="dxa"/>
-              <w:bottom w:w="100" w:type="dxa"/>
-              <w:left w:w="150" w:type="dxa"/>
-              <w:right w:w="150" w:type="dxa"/>
-            </w:tcMar>
-          </w:tcPr>
-          <w:p>
-            <w:pPr>
-              <w:spacing w:before="0" w:after="0"/>
-              <w:jc w:val="left"/>
-            </w:pPr>
-            <w:r>
-              <w:rPr>
-                <w:rFonts w:ascii="Arial" w:hAnsi="Arial"/>
-                <w:color w:val="334155"/>
-                <w:sz w:val="18"/>
-              </w:rPr>
-              <w:t>Formatted Modal</w:t>
-            </w:r>
-          </w:p>
-        </w:tc>
-        <w:tc>
-          <w:tcPr>
-            <w:tcW w:type="dxa" w:w="1728"/>
-            <w:shd w:fill="FFFFFF"/>
-            <w:tcMar>
-              <w:top w:w="100" w:type="dxa"/>
-              <w:bottom w:w="100" w:type="dxa"/>
-              <w:left w:w="150" w:type="dxa"/>
-              <w:right w:w="150" w:type="dxa"/>
-            </w:tcMar>
-          </w:tcPr>
-          <w:p>
-            <w:pPr>
-              <w:spacing w:before="0" w:after="0"/>
-              <w:jc w:val="left"/>
-            </w:pPr>
-            <w:r>
-              <w:rPr>
-                <w:rFonts w:ascii="Arial" w:hAnsi="Arial"/>
-                <w:color w:val="334155"/>
-                <w:sz w:val="18"/>
-              </w:rPr>
-              <w:t>Formatted Modal</w:t>
-            </w:r>
-          </w:p>
-        </w:tc>
-        <w:tc>
-          <w:tcPr>
-            <w:tcW w:type="dxa" w:w="1728"/>
-            <w:shd w:fill="FFFFFF"/>
-            <w:tcMar>
-              <w:top w:w="100" w:type="dxa"/>
-              <w:bottom w:w="100" w:type="dxa"/>
-              <w:left w:w="150" w:type="dxa"/>
-              <w:right w:w="150" w:type="dxa"/>
-            </w:tcMar>
-          </w:tcPr>
-          <w:p>
-            <w:pPr>
-              <w:spacing w:before="0" w:after="0"/>
-              <w:jc w:val="left"/>
-            </w:pPr>
-            <w:r>
-              <w:rPr>
-                <w:rFonts w:ascii="Arial" w:hAnsi="Arial"/>
-                <w:color w:val="334155"/>
-                <w:sz w:val="18"/>
-              </w:rPr>
-              <w:t>Instant Print &amp; PDF Modal</w:t>
-            </w:r>
-          </w:p>
-        </w:tc>
-      </w:tr>
-      <w:tr>
-        <w:tc>
-          <w:tcPr>
-            <w:tcW w:type="dxa" w:w="3312"/>
-            <w:shd w:fill="F1F5F9"/>
-            <w:tcMar>
-              <w:top w:w="100" w:type="dxa"/>
-              <w:bottom w:w="100" w:type="dxa"/>
-              <w:left w:w="150" w:type="dxa"/>
-              <w:right w:w="150" w:type="dxa"/>
-            </w:tcMar>
-          </w:tcPr>
-          <w:p>
-            <w:pPr>
-              <w:spacing w:before="0" w:after="0"/>
-              <w:jc w:val="left"/>
-            </w:pPr>
-            <w:r>
-              <w:rPr>
-                <w:rFonts w:ascii="Arial" w:hAnsi="Arial"/>
-                <w:color w:val="334155"/>
-                <w:sz w:val="18"/>
-              </w:rPr>
-              <w:t>Active Test Subdomain</w:t>
-            </w:r>
-          </w:p>
-        </w:tc>
-        <w:tc>
-          <w:tcPr>
-            <w:tcW w:type="dxa" w:w="1584"/>
-            <w:shd w:fill="F1F5F9"/>
-            <w:tcMar>
-              <w:top w:w="100" w:type="dxa"/>
-              <w:bottom w:w="100" w:type="dxa"/>
-              <w:left w:w="150" w:type="dxa"/>
-              <w:right w:w="150" w:type="dxa"/>
-            </w:tcMar>
-          </w:tcPr>
-          <w:p>
-            <w:pPr>
-              <w:spacing w:before="0" w:after="0"/>
-              <w:jc w:val="left"/>
-            </w:pPr>
-            <w:r>
-              <w:rPr>
-                <w:rFonts w:ascii="Arial" w:hAnsi="Arial"/>
-                <w:color w:val="334155"/>
-                <w:sz w:val="18"/>
-              </w:rPr>
-              <w:t>test.ilovequote.com</w:t>
-            </w:r>
-          </w:p>
-        </w:tc>
-        <w:tc>
-          <w:tcPr>
-            <w:tcW w:type="dxa" w:w="1584"/>
-            <w:shd w:fill="F1F5F9"/>
-            <w:tcMar>
-              <w:top w:w="100" w:type="dxa"/>
-              <w:bottom w:w="100" w:type="dxa"/>
-              <w:left w:w="150" w:type="dxa"/>
-              <w:right w:w="150" w:type="dxa"/>
-            </w:tcMar>
-          </w:tcPr>
-          <w:p>
-            <w:pPr>
-              <w:spacing w:before="0" w:after="0"/>
-              <w:jc w:val="left"/>
-            </w:pPr>
-            <w:r>
-              <w:rPr>
-                <w:rFonts w:ascii="Arial" w:hAnsi="Arial"/>
-                <w:color w:val="334155"/>
-                <w:sz w:val="18"/>
-              </w:rPr>
-              <w:t>test.ilovequote.com</w:t>
-            </w:r>
-          </w:p>
-        </w:tc>
-        <w:tc>
-          <w:tcPr>
-            <w:tcW w:type="dxa" w:w="1728"/>
-            <w:shd w:fill="F1F5F9"/>
-            <w:tcMar>
-              <w:top w:w="100" w:type="dxa"/>
-              <w:bottom w:w="100" w:type="dxa"/>
-              <w:left w:w="150" w:type="dxa"/>
-              <w:right w:w="150" w:type="dxa"/>
-            </w:tcMar>
-          </w:tcPr>
-          <w:p>
-            <w:pPr>
-              <w:spacing w:before="0" w:after="0"/>
-              <w:jc w:val="left"/>
-            </w:pPr>
-            <w:r>
-              <w:rPr>
-                <w:rFonts w:ascii="Arial" w:hAnsi="Arial"/>
-                <w:color w:val="334155"/>
-                <w:sz w:val="18"/>
-              </w:rPr>
-              <w:t>test.ilovequote.com</w:t>
-            </w:r>
-          </w:p>
-        </w:tc>
-        <w:tc>
-          <w:tcPr>
-            <w:tcW w:type="dxa" w:w="1728"/>
-            <w:shd w:fill="F1F5F9"/>
-            <w:tcMar>
-              <w:top w:w="100" w:type="dxa"/>
-              <w:bottom w:w="100" w:type="dxa"/>
-              <w:left w:w="150" w:type="dxa"/>
-              <w:right w:w="150" w:type="dxa"/>
-            </w:tcMar>
-          </w:tcPr>
-          <w:p>
-            <w:pPr>
-              <w:spacing w:before="0" w:after="0"/>
-              <w:jc w:val="left"/>
-            </w:pPr>
-            <w:r>
-              <w:rPr>
-                <w:rFonts w:ascii="Arial" w:hAnsi="Arial"/>
-                <w:color w:val="334155"/>
-                <w:sz w:val="18"/>
-              </w:rPr>
-              <w:t>test.ilovequote.com</w:t>
+              <w:t>Strictly Separate</w:t>
             </w:r>
           </w:p>
         </w:tc>
@@ -6360,7 +7181,7 @@
                 <w:color w:val="1E293B"/>
                 <w:sz w:val="20"/>
               </w:rPr>
-              <w:t xml:space="preserve">Live Deployment &amp; Access Links: </w:t>
+              <w:t xml:space="preserve">Deployment &amp; Access Directory: </w:t>
             </w:r>
             <w:r>
               <w:rPr>
@@ -6368,15 +7189,19 @@
                 <w:color w:val="475569"/>
                 <w:sz w:val="19"/>
               </w:rPr>
-              <w:t>• Review 4 Active Target: https://test.ilovequote.com/#/page2 (and https://test.ilovequote.com/page2)</w:t>
+              <w:t>• Review 4 Isolated Branch: review4 (Code permanently preserved, never merged into older branches)</w:t>
               <w:br/>
-              <w:t>• Review 3 Active Target: https://test.ilovequote.com/#/create-quote2</w:t>
+              <w:t>• Review 4 Dedicated Route: https://test.ilovequote.com/#/page2 (and https://test.ilovequote.com/page2)</w:t>
               <w:br/>
-              <w:t>• Review 1 &amp; 2 Active Target: https://test.ilovequote.com/#/create-quote</w:t>
+              <w:t>• Review 3 Isolated Branch: review3 / preview3 (Route: https://test.ilovequote.com/#/create-quote2)</w:t>
+              <w:br/>
+              <w:t>• Review 2 Isolated Branch: preview2 (Route: https://test.ilovequote.com/#/create-quote)</w:t>
+              <w:br/>
+              <w:t>• Review 1 Isolated Branch: preview1 (Route: https://test.ilovequote.com/#/create-quote)</w:t>
               <w:br/>
               <w:t>• Git Repository: https://github.com/clientfoster/ilovequote</w:t>
               <w:br/>
-              <w:t>• Backup Branches: review4 (V4 Backup), review3 (Active Test Subdomain), preview3 (V3), preview2 (V2), preview1 (V1), main (Production).</w:t>
+              <w:t>• Consolidated Record: iLoveQuote_Version_Change_Records_All_Reviews.docx</w:t>
             </w:r>
           </w:p>
         </w:tc>

</xml_diff>